<commit_message>
Update repository URL in report to seuecsxt-droid
</commit_message>
<xml_diff>
--- a/ECO6130_Group8_Final_Report.docx
+++ b/ECO6130_Group8_Final_Report.docx
@@ -128,7 +128,7 @@
             <w:sz w:val="22"/>
             <w:szCs w:val="22"/>
           </w:rPr>
-          <w:t xml:space="preserve">github.com/ctiancai666-hub/6130-group8</w:t>
+          <w:t xml:space="preserve">github.com/seuecsxt-droid/6130-group8</w:t>
         </w:r>
       </w:hyperlink>
     </w:p>
@@ -5125,7 +5125,7 @@
             <w:sz w:val="22"/>
             <w:szCs w:val="22"/>
           </w:rPr>
-          <w:t xml:space="preserve">github.com/ctiancai666-hub/6130-group8</w:t>
+          <w:t xml:space="preserve">github.com/seuecsxt-droid/6130-group8</w:t>
         </w:r>
       </w:hyperlink>
     </w:p>

</xml_diff>